<commit_message>
Add live benchmark evidence to compression article
</commit_message>
<xml_diff>
--- a/posts/compression-algorithms-gzip-snappy-lz4-zstd.docx
+++ b/posts/compression-algorithms-gzip-snappy-lz4-zstd.docx
@@ -8,7 +8,7 @@
         <w:pStyle w:val="Heading1"/>
       </w:pPr>
       <w:r>
-        <w:t xml:space="preserve">Compression Algorithms You Probably Inherited: gzip, Snappy, LZ4, zstd</w:t>
+        <w:t>Compression Algorithms You Probably Inherited: gzip, Snappy, LZ4, zstd — and What’s Newer</w:t>
       </w:r>
     </w:p>
     <w:bookmarkStart w:id="9" w:name="Xb953f173b8dcb03db4e8ea7577274a41372c6c9"/>
@@ -127,6 +127,46 @@
         <w:pStyle w:val="Heading2"/>
       </w:pPr>
       <w:r>
+        <w:t>Reproducible Benchmark</w:t>
+      </w:r>
+    </w:p>
+    <w:p>
+      <w:pPr>
+        <w:pStyle w:val="FirstParagraph"/>
+      </w:pPr>
+      <w:r>
+        <w:t xml:space="preserve">The recommendations below are now backed by an open, reproducible benchmark. </w:t>
+      </w:r>
+      <w:hyperlink r:id="rId9">
+        <w:r>
+          <w:rPr>
+            <w:color w:val="0563C1"/>
+            <w:u w:val="single"/>
+          </w:rPr>
+          <w:t>View the GitHub repository</w:t>
+        </w:r>
+      </w:hyperlink>
+      <w:r>
+        <w:t xml:space="preserve"> or </w:t>
+      </w:r>
+      <w:hyperlink r:id="rId10">
+        <w:r>
+          <w:rPr>
+            <w:color w:val="0563C1"/>
+            <w:u w:val="single"/>
+          </w:rPr>
+          <w:t>open the live July 2026 report</w:t>
+        </w:r>
+      </w:hyperlink>
+      <w:r>
+        <w:t>. The benchmark downloads public datasets on demand and publishes exact settings, raw samples, summary CSVs, hardware details, and matrix charts.</w:t>
+      </w:r>
+    </w:p>
+    <w:p>
+      <w:pPr>
+        <w:pStyle w:val="Heading2"/>
+      </w:pPr>
+      <w:r>
         <w:t xml:space="preserve">Why Compression Choices Matter</w:t>
       </w:r>
     </w:p>
@@ -408,17 +448,7 @@
         </w:numPr>
       </w:pPr>
       <w:r>
-        <w:rPr>
-          <w:b/>
-          <w:bCs/>
-        </w:rPr>
-        <w:t xml:space="preserve">When to use:</w:t>
-      </w:r>
-      <w:r>
-        <w:t xml:space="preserve"> </w:t>
-      </w:r>
-      <w:r>
-        <w:t xml:space="preserve">Archival, or compatibility with legacy tools. Otherwise, avoid.</w:t>
+        <w:t>When to use: Broad compatibility, established web tooling, or legacy systems where changing formats has limited value.</w:t>
       </w:r>
     </w:p>
     <w:bookmarkEnd w:id="11"/>
@@ -626,17 +656,7 @@
         </w:numPr>
       </w:pPr>
       <w:r>
-        <w:rPr>
-          <w:b/>
-          <w:bCs/>
-        </w:rPr>
-        <w:t xml:space="preserve">Speed:</w:t>
-      </w:r>
-      <w:r>
-        <w:t xml:space="preserve"> </w:t>
-      </w:r>
-      <w:r>
-        <w:t xml:space="preserve">&gt; 500 MB/s compression; GB/s decompression.</w:t>
+        <w:t>Speed: Workload-dependent. In this run, LZ4 level 0 compressed enwik9 at 344 MB/s and decompressed it at 634 MB/s.</w:t>
       </w:r>
     </w:p>
     <w:p>
@@ -768,17 +788,7 @@
         </w:numPr>
       </w:pPr>
       <w:r>
-        <w:rPr>
-          <w:b/>
-          <w:bCs/>
-        </w:rPr>
-        <w:t xml:space="preserve">Speed:</w:t>
-      </w:r>
-      <w:r>
-        <w:t xml:space="preserve"> </w:t>
-      </w:r>
-      <w:r>
-        <w:t xml:space="preserve">Compression 500+ MB/s; decompression ~1500+ MB/s.</w:t>
+        <w:t>Speed: Workload-dependent. In this run, zstd level 3 compressed enwik9 at 114 MB/s and GitHub Archive JSON at 389 MB/s.</w:t>
       </w:r>
     </w:p>
     <w:p>
@@ -850,6 +860,70 @@
     <w:bookmarkEnd w:id="14"/>
     <w:bookmarkEnd w:id="15"/>
     <w:bookmarkStart w:id="16" w:name="strengths-and-weaknesses-at-a-glance"/>
+    <w:p>
+      <w:pPr>
+        <w:pStyle w:val="Heading3"/>
+      </w:pPr>
+      <w:r>
+        <w:t>Brotli</w:t>
+      </w:r>
+    </w:p>
+    <w:p>
+      <w:pPr>
+        <w:pStyle w:val="Compact"/>
+      </w:pPr>
+      <w:r>
+        <w:t>What it is: A modern codec developed by Google and widely used for HTTP content.</w:t>
+      </w:r>
+    </w:p>
+    <w:p>
+      <w:pPr>
+        <w:pStyle w:val="Compact"/>
+      </w:pPr>
+      <w:r>
+        <w:t>Measured result: 3.60× ratio, 34 MB/s compression, and 219 MB/s decompression on enwik9 at level 5.</w:t>
+      </w:r>
+    </w:p>
+    <w:p>
+      <w:pPr>
+        <w:pStyle w:val="Compact"/>
+      </w:pPr>
+      <w:r>
+        <w:t>When to use: Web assets and static content when better density than gzip is worth additional compression CPU.</w:t>
+      </w:r>
+    </w:p>
+    <w:p>
+      <w:pPr>
+        <w:pStyle w:val="Heading3"/>
+      </w:pPr>
+      <w:r>
+        <w:t>XZ/LZMA</w:t>
+      </w:r>
+    </w:p>
+    <w:p>
+      <w:pPr>
+        <w:pStyle w:val="Compact"/>
+      </w:pPr>
+      <w:r>
+        <w:t>What it is: A high-density codec commonly used for archives and software distribution.</w:t>
+      </w:r>
+    </w:p>
+    <w:p>
+      <w:pPr>
+        <w:pStyle w:val="Compact"/>
+      </w:pPr>
+      <w:r>
+        <w:t>Measured result: The best enwik9 ratio at 4.34×, but only 1.3 MB/s compression and 61 MB/s decompression at level 6.</w:t>
+      </w:r>
+    </w:p>
+    <w:p>
+      <w:pPr>
+        <w:pStyle w:val="Compact"/>
+      </w:pPr>
+      <w:r>
+        <w:t>When to use: One-time archival or static distribution, not latency-sensitive pipelines.</w:t>
+      </w:r>
+    </w:p>
     <w:p>
       <w:pPr>
         <w:pStyle w:val="Heading2"/>
@@ -1160,6 +1234,110 @@
           </w:p>
         </w:tc>
       </w:tr>
+      <w:tr>
+        <w:tc>
+          <w:tcPr>
+            <w:tcW w:type="dxa" w:w="1584"/>
+          </w:tcPr>
+          <w:p>
+            <w:r>
+              <w:t>Brotli</w:t>
+            </w:r>
+          </w:p>
+        </w:tc>
+        <w:tc>
+          <w:tcPr>
+            <w:tcW w:type="dxa" w:w="1584"/>
+          </w:tcPr>
+          <w:p>
+            <w:r>
+              <w:t>High</w:t>
+            </w:r>
+          </w:p>
+        </w:tc>
+        <w:tc>
+          <w:tcPr>
+            <w:tcW w:type="dxa" w:w="1584"/>
+          </w:tcPr>
+          <w:p>
+            <w:r>
+              <w:t>Slow</w:t>
+            </w:r>
+          </w:p>
+        </w:tc>
+        <w:tc>
+          <w:tcPr>
+            <w:tcW w:type="dxa" w:w="1584"/>
+          </w:tcPr>
+          <w:p>
+            <w:r>
+              <w:t>Fast</w:t>
+            </w:r>
+          </w:p>
+        </w:tc>
+        <w:tc>
+          <w:tcPr>
+            <w:tcW w:type="dxa" w:w="1584"/>
+          </w:tcPr>
+          <w:p>
+            <w:r>
+              <w:t>HTTP and static web content</w:t>
+            </w:r>
+          </w:p>
+        </w:tc>
+      </w:tr>
+      <w:tr>
+        <w:tc>
+          <w:tcPr>
+            <w:tcW w:type="dxa" w:w="1584"/>
+          </w:tcPr>
+          <w:p>
+            <w:r>
+              <w:t>XZ/LZMA</w:t>
+            </w:r>
+          </w:p>
+        </w:tc>
+        <w:tc>
+          <w:tcPr>
+            <w:tcW w:type="dxa" w:w="1584"/>
+          </w:tcPr>
+          <w:p>
+            <w:r>
+              <w:t>Very High</w:t>
+            </w:r>
+          </w:p>
+        </w:tc>
+        <w:tc>
+          <w:tcPr>
+            <w:tcW w:type="dxa" w:w="1584"/>
+          </w:tcPr>
+          <w:p>
+            <w:r>
+              <w:t>Extremely Slow</w:t>
+            </w:r>
+          </w:p>
+        </w:tc>
+        <w:tc>
+          <w:tcPr>
+            <w:tcW w:type="dxa" w:w="1584"/>
+          </w:tcPr>
+          <w:p>
+            <w:r>
+              <w:t>Slow</w:t>
+            </w:r>
+          </w:p>
+        </w:tc>
+        <w:tc>
+          <w:tcPr>
+            <w:tcW w:type="dxa" w:w="1584"/>
+          </w:tcPr>
+          <w:p>
+            <w:r>
+              <w:t>One-time archival and distribution</w:t>
+            </w:r>
+          </w:p>
+        </w:tc>
+      </w:tr>
     </w:tbl>
     <w:bookmarkEnd w:id="16"/>
     <w:bookmarkStart w:id="23" w:name="real-world-scenarios-when-to-use-what"/>
@@ -1168,6 +1346,419 @@
         <w:pStyle w:val="Heading2"/>
       </w:pPr>
       <w:r>
+        <w:t>Live Benchmark Results</w:t>
+      </w:r>
+    </w:p>
+    <w:p>
+      <w:pPr>
+        <w:pStyle w:val="FirstParagraph"/>
+      </w:pPr>
+      <w:r>
+        <w:t>The July 2026 standard run processed 2.43 GiB of public data with six codecs, five measured repetitions per case, and zero failures. These enwik9 results show the trade-off on a 1 GB Wikipedia text input:</w:t>
+      </w:r>
+    </w:p>
+    <w:tbl>
+      <w:tblPr>
+        <w:tblW w:type="auto" w:w="0"/>
+        <w:tblLook w:firstColumn="1" w:firstRow="1" w:lastColumn="0" w:lastRow="0" w:noHBand="0" w:noVBand="1" w:val="04A0"/>
+      </w:tblPr>
+      <w:tblGrid>
+        <w:gridCol w:w="1872"/>
+        <w:gridCol w:w="1872"/>
+        <w:gridCol w:w="1872"/>
+        <w:gridCol w:w="1872"/>
+        <w:gridCol w:w="1872"/>
+      </w:tblGrid>
+      <w:tr>
+        <w:tc>
+          <w:tcPr>
+            <w:tcW w:type="dxa" w:w="1872"/>
+          </w:tcPr>
+          <w:p>
+            <w:r>
+              <w:t>Codec</w:t>
+            </w:r>
+          </w:p>
+        </w:tc>
+        <w:tc>
+          <w:tcPr>
+            <w:tcW w:type="dxa" w:w="1872"/>
+          </w:tcPr>
+          <w:p>
+            <w:r>
+              <w:t>Ratio</w:t>
+            </w:r>
+          </w:p>
+        </w:tc>
+        <w:tc>
+          <w:tcPr>
+            <w:tcW w:type="dxa" w:w="1872"/>
+          </w:tcPr>
+          <w:p>
+            <w:r>
+              <w:t>Compress MB/s</w:t>
+            </w:r>
+          </w:p>
+        </w:tc>
+        <w:tc>
+          <w:tcPr>
+            <w:tcW w:type="dxa" w:w="1872"/>
+          </w:tcPr>
+          <w:p>
+            <w:r>
+              <w:t>Decompress MB/s</w:t>
+            </w:r>
+          </w:p>
+        </w:tc>
+        <w:tc>
+          <w:tcPr>
+            <w:tcW w:type="dxa" w:w="1872"/>
+          </w:tcPr>
+          <w:p>
+            <w:r>
+              <w:t>RSS MiB</w:t>
+            </w:r>
+          </w:p>
+        </w:tc>
+      </w:tr>
+      <w:tr>
+        <w:tc>
+          <w:tcPr>
+            <w:tcW w:type="dxa" w:w="1872"/>
+          </w:tcPr>
+          <w:p>
+            <w:r>
+              <w:t>gzip 6</w:t>
+            </w:r>
+          </w:p>
+        </w:tc>
+        <w:tc>
+          <w:tcPr>
+            <w:tcW w:type="dxa" w:w="1872"/>
+          </w:tcPr>
+          <w:p>
+            <w:r>
+              <w:t>3.09×</w:t>
+            </w:r>
+          </w:p>
+        </w:tc>
+        <w:tc>
+          <w:tcPr>
+            <w:tcW w:type="dxa" w:w="1872"/>
+          </w:tcPr>
+          <w:p>
+            <w:r>
+              <w:t>18</w:t>
+            </w:r>
+          </w:p>
+        </w:tc>
+        <w:tc>
+          <w:tcPr>
+            <w:tcW w:type="dxa" w:w="1872"/>
+          </w:tcPr>
+          <w:p>
+            <w:r>
+              <w:t>178</w:t>
+            </w:r>
+          </w:p>
+        </w:tc>
+        <w:tc>
+          <w:tcPr>
+            <w:tcW w:type="dxa" w:w="1872"/>
+          </w:tcPr>
+          <w:p>
+            <w:r>
+              <w:t>30.5</w:t>
+            </w:r>
+          </w:p>
+        </w:tc>
+      </w:tr>
+      <w:tr>
+        <w:tc>
+          <w:tcPr>
+            <w:tcW w:type="dxa" w:w="1872"/>
+          </w:tcPr>
+          <w:p>
+            <w:r>
+              <w:t>Snappy 1</w:t>
+            </w:r>
+          </w:p>
+        </w:tc>
+        <w:tc>
+          <w:tcPr>
+            <w:tcW w:type="dxa" w:w="1872"/>
+          </w:tcPr>
+          <w:p>
+            <w:r>
+              <w:t>1.97×</w:t>
+            </w:r>
+          </w:p>
+        </w:tc>
+        <w:tc>
+          <w:tcPr>
+            <w:tcW w:type="dxa" w:w="1872"/>
+          </w:tcPr>
+          <w:p>
+            <w:r>
+              <w:t>313</w:t>
+            </w:r>
+          </w:p>
+        </w:tc>
+        <w:tc>
+          <w:tcPr>
+            <w:tcW w:type="dxa" w:w="1872"/>
+          </w:tcPr>
+          <w:p>
+            <w:r>
+              <w:t>358</w:t>
+            </w:r>
+          </w:p>
+        </w:tc>
+        <w:tc>
+          <w:tcPr>
+            <w:tcW w:type="dxa" w:w="1872"/>
+          </w:tcPr>
+          <w:p>
+            <w:r>
+              <w:t>35.4</w:t>
+            </w:r>
+          </w:p>
+        </w:tc>
+      </w:tr>
+      <w:tr>
+        <w:tc>
+          <w:tcPr>
+            <w:tcW w:type="dxa" w:w="1872"/>
+          </w:tcPr>
+          <w:p>
+            <w:r>
+              <w:t>LZ4 0</w:t>
+            </w:r>
+          </w:p>
+        </w:tc>
+        <w:tc>
+          <w:tcPr>
+            <w:tcW w:type="dxa" w:w="1872"/>
+          </w:tcPr>
+          <w:p>
+            <w:r>
+              <w:t>1.96×</w:t>
+            </w:r>
+          </w:p>
+        </w:tc>
+        <w:tc>
+          <w:tcPr>
+            <w:tcW w:type="dxa" w:w="1872"/>
+          </w:tcPr>
+          <w:p>
+            <w:r>
+              <w:t>344</w:t>
+            </w:r>
+          </w:p>
+        </w:tc>
+        <w:tc>
+          <w:tcPr>
+            <w:tcW w:type="dxa" w:w="1872"/>
+          </w:tcPr>
+          <w:p>
+            <w:r>
+              <w:t>634</w:t>
+            </w:r>
+          </w:p>
+        </w:tc>
+        <w:tc>
+          <w:tcPr>
+            <w:tcW w:type="dxa" w:w="1872"/>
+          </w:tcPr>
+          <w:p>
+            <w:r>
+              <w:t>33.0</w:t>
+            </w:r>
+          </w:p>
+        </w:tc>
+      </w:tr>
+      <w:tr>
+        <w:tc>
+          <w:tcPr>
+            <w:tcW w:type="dxa" w:w="1872"/>
+          </w:tcPr>
+          <w:p>
+            <w:r>
+              <w:t>zstd 3</w:t>
+            </w:r>
+          </w:p>
+        </w:tc>
+        <w:tc>
+          <w:tcPr>
+            <w:tcW w:type="dxa" w:w="1872"/>
+          </w:tcPr>
+          <w:p>
+            <w:r>
+              <w:t>3.19×</w:t>
+            </w:r>
+          </w:p>
+        </w:tc>
+        <w:tc>
+          <w:tcPr>
+            <w:tcW w:type="dxa" w:w="1872"/>
+          </w:tcPr>
+          <w:p>
+            <w:r>
+              <w:t>114</w:t>
+            </w:r>
+          </w:p>
+        </w:tc>
+        <w:tc>
+          <w:tcPr>
+            <w:tcW w:type="dxa" w:w="1872"/>
+          </w:tcPr>
+          <w:p>
+            <w:r>
+              <w:t>142</w:t>
+            </w:r>
+          </w:p>
+        </w:tc>
+        <w:tc>
+          <w:tcPr>
+            <w:tcW w:type="dxa" w:w="1872"/>
+          </w:tcPr>
+          <w:p>
+            <w:r>
+              <w:t>41.9</w:t>
+            </w:r>
+          </w:p>
+        </w:tc>
+      </w:tr>
+      <w:tr>
+        <w:tc>
+          <w:tcPr>
+            <w:tcW w:type="dxa" w:w="1872"/>
+          </w:tcPr>
+          <w:p>
+            <w:r>
+              <w:t>Brotli 5</w:t>
+            </w:r>
+          </w:p>
+        </w:tc>
+        <w:tc>
+          <w:tcPr>
+            <w:tcW w:type="dxa" w:w="1872"/>
+          </w:tcPr>
+          <w:p>
+            <w:r>
+              <w:t>3.60×</w:t>
+            </w:r>
+          </w:p>
+        </w:tc>
+        <w:tc>
+          <w:tcPr>
+            <w:tcW w:type="dxa" w:w="1872"/>
+          </w:tcPr>
+          <w:p>
+            <w:r>
+              <w:t>34</w:t>
+            </w:r>
+          </w:p>
+        </w:tc>
+        <w:tc>
+          <w:tcPr>
+            <w:tcW w:type="dxa" w:w="1872"/>
+          </w:tcPr>
+          <w:p>
+            <w:r>
+              <w:t>219</w:t>
+            </w:r>
+          </w:p>
+        </w:tc>
+        <w:tc>
+          <w:tcPr>
+            <w:tcW w:type="dxa" w:w="1872"/>
+          </w:tcPr>
+          <w:p>
+            <w:r>
+              <w:t>60.8</w:t>
+            </w:r>
+          </w:p>
+        </w:tc>
+      </w:tr>
+      <w:tr>
+        <w:tc>
+          <w:tcPr>
+            <w:tcW w:type="dxa" w:w="1872"/>
+          </w:tcPr>
+          <w:p>
+            <w:r>
+              <w:t>XZ 6</w:t>
+            </w:r>
+          </w:p>
+        </w:tc>
+        <w:tc>
+          <w:tcPr>
+            <w:tcW w:type="dxa" w:w="1872"/>
+          </w:tcPr>
+          <w:p>
+            <w:r>
+              <w:t>4.34×</w:t>
+            </w:r>
+          </w:p>
+        </w:tc>
+        <w:tc>
+          <w:tcPr>
+            <w:tcW w:type="dxa" w:w="1872"/>
+          </w:tcPr>
+          <w:p>
+            <w:r>
+              <w:t>1.3</w:t>
+            </w:r>
+          </w:p>
+        </w:tc>
+        <w:tc>
+          <w:tcPr>
+            <w:tcW w:type="dxa" w:w="1872"/>
+          </w:tcPr>
+          <w:p>
+            <w:r>
+              <w:t>61</w:t>
+            </w:r>
+          </w:p>
+        </w:tc>
+        <w:tc>
+          <w:tcPr>
+            <w:tcW w:type="dxa" w:w="1872"/>
+          </w:tcPr>
+          <w:p>
+            <w:r>
+              <w:t>110.9</w:t>
+            </w:r>
+          </w:p>
+        </w:tc>
+      </w:tr>
+    </w:tbl>
+    <w:p>
+      <w:pPr>
+        <w:pStyle w:val="BodyText"/>
+      </w:pPr>
+      <w:r>
+        <w:t xml:space="preserve">On 977.8 MiB of GitHub Archive JSON, zstd reached an 11.3× ratio at 389 MB/s, while LZ4 decompressed at 617 MB/s and Snappy compressed at 570 MB/s. The data type changes the result, so use the matrices rather than treating one codec as universally best. </w:t>
+      </w:r>
+      <w:hyperlink r:id="rId10">
+        <w:r>
+          <w:rPr>
+            <w:color w:val="0563C1"/>
+            <w:u w:val="single"/>
+          </w:rPr>
+          <w:t>Explore the live result matrices</w:t>
+        </w:r>
+      </w:hyperlink>
+      <w:r>
+        <w:t>.</w:t>
+      </w:r>
+    </w:p>
+    <w:p>
+      <w:pPr>
+        <w:pStyle w:val="Heading2"/>
+      </w:pPr>
+      <w:r>
         <w:t xml:space="preserve">Real-World Scenarios: When to Use What</w:t>
       </w:r>
     </w:p>
@@ -1265,17 +1856,7 @@
         </w:numPr>
       </w:pPr>
       <w:r>
-        <w:rPr>
-          <w:b/>
-          <w:bCs/>
-        </w:rPr>
-        <w:t xml:space="preserve">Why:</w:t>
-      </w:r>
-      <w:r>
-        <w:t xml:space="preserve"> </w:t>
-      </w:r>
-      <w:r>
-        <w:t xml:space="preserve">Best compression ratio reduces storage cost and IO. The slight CPU trade-off is acceptable.</w:t>
+        <w:t>Why: zstd delivers a strong compression ratio with practical throughput. XZ can compress smaller, but its much slower encoding is usually unsuitable for recurring data-pipeline workloads.</w:t>
       </w:r>
     </w:p>
     <w:bookmarkEnd w:id="18"/>
@@ -1538,7 +2119,7 @@
         </w:numPr>
       </w:pPr>
       <w:r>
-        <w:t xml:space="preserve">LZ4 is unbeatable when speed matters more than compression.</w:t>
+        <w:t>LZ4 is often the leading choice when speed matters more than compression density.</w:t>
       </w:r>
     </w:p>
     <w:p>

</xml_diff>